<commit_message>
Update questions to 20, add FAISS vs ChromaDB evaluation, increase MAX_QUESTIONS to 20
- Updated questions.txt with 20 medical questions (appendicitis, varicose veins, melanoma, diabetes, MRSA, migraine, hypertension, stroke, kidney stones)
- Increased MAX_QUESTIONS from 5 to 20 in all evaluation scripts
- Added evaluation_FAISS_ChromaDB.py for ChromaDB vs FAISS comparison
- Replaced evaluation_improvements_ragas.py with evaluation_FAISS_ChromaDB.py
- Added chart_chroma_vs_faiss.png comparison chart
- Removed outdated report docs and charts
- Updated all result JSON/CSV files

Co-Authored-By: Claude Sonnet 4.6 <noreply@anthropic.com>
</commit_message>
<xml_diff>
--- a/Fair_Comparison_Report.docx
+++ b/Fair_Comparison_Report.docx
@@ -165,7 +165,7 @@
               <w:rPr>
                 <w:sz w:val="20"/>
               </w:rPr>
-              <w:t>88.0%</w:t>
+              <w:t>80.0%</w:t>
             </w:r>
           </w:p>
         </w:tc>
@@ -197,7 +197,7 @@
               <w:rPr>
                 <w:sz w:val="20"/>
               </w:rPr>
-              <w:t>+12.0%</w:t>
+              <w:t>+20.0%</w:t>
             </w:r>
           </w:p>
         </w:tc>
@@ -297,7 +297,7 @@
               <w:rPr>
                 <w:sz w:val="20"/>
               </w:rPr>
-              <w:t>51.9%</w:t>
+              <w:t>46.8%</w:t>
             </w:r>
           </w:p>
         </w:tc>
@@ -313,7 +313,7 @@
               <w:rPr>
                 <w:sz w:val="20"/>
               </w:rPr>
-              <w:t>63.7%</w:t>
+              <w:t>62.9%</w:t>
             </w:r>
           </w:p>
         </w:tc>
@@ -329,7 +329,7 @@
               <w:rPr>
                 <w:sz w:val="20"/>
               </w:rPr>
-              <w:t>+11.8%</w:t>
+              <w:t>+16.0%</w:t>
             </w:r>
           </w:p>
         </w:tc>
@@ -384,1416 +384,7 @@
         <w:rPr>
           <w:color w:val="1A1A2E"/>
         </w:rPr>
-        <w:t>3. Per-Question Breakdown</w:t>
-      </w:r>
-    </w:p>
-    <w:p>
-      <w:pPr>
-        <w:pStyle w:val="Heading2"/>
-      </w:pPr>
-      <w:r>
-        <w:rPr>
-          <w:color w:val="1A1A2E"/>
-        </w:rPr>
-        <w:t>3.1 Faithfulness</w:t>
-      </w:r>
-    </w:p>
-    <w:tbl>
-      <w:tblPr>
-        <w:tblStyle w:val="LightGrid-Accent1"/>
-        <w:tblW w:type="auto" w:w="0"/>
-        <w:jc w:val="center"/>
-        <w:tblLook w:firstColumn="1" w:firstRow="1" w:lastColumn="0" w:lastRow="0" w:noHBand="0" w:noVBand="1" w:val="04A0"/>
-      </w:tblPr>
-      <w:tblGrid>
-        <w:gridCol w:w="2160"/>
-        <w:gridCol w:w="2160"/>
-        <w:gridCol w:w="2160"/>
-        <w:gridCol w:w="2160"/>
-      </w:tblGrid>
-      <w:tr>
-        <w:tc>
-          <w:tcPr>
-            <w:tcW w:type="dxa" w:w="2160"/>
-          </w:tcPr>
-          <w:p>
-            <w:pPr>
-              <w:jc w:val="center"/>
-            </w:pPr>
-            <w:r>
-              <w:rPr>
-                <w:b/>
-                <w:sz w:val="20"/>
-              </w:rPr>
-              <w:t>Question</w:t>
-            </w:r>
-          </w:p>
-        </w:tc>
-        <w:tc>
-          <w:tcPr>
-            <w:tcW w:type="dxa" w:w="2160"/>
-          </w:tcPr>
-          <w:p>
-            <w:pPr>
-              <w:jc w:val="center"/>
-            </w:pPr>
-            <w:r>
-              <w:rPr>
-                <w:b/>
-                <w:sz w:val="20"/>
-              </w:rPr>
-              <w:t>Ollama</w:t>
-            </w:r>
-          </w:p>
-        </w:tc>
-        <w:tc>
-          <w:tcPr>
-            <w:tcW w:type="dxa" w:w="2160"/>
-          </w:tcPr>
-          <w:p>
-            <w:pPr>
-              <w:jc w:val="center"/>
-            </w:pPr>
-            <w:r>
-              <w:rPr>
-                <w:b/>
-                <w:sz w:val="20"/>
-              </w:rPr>
-              <w:t>Groq</w:t>
-            </w:r>
-          </w:p>
-        </w:tc>
-        <w:tc>
-          <w:tcPr>
-            <w:tcW w:type="dxa" w:w="2160"/>
-          </w:tcPr>
-          <w:p>
-            <w:pPr>
-              <w:jc w:val="center"/>
-            </w:pPr>
-            <w:r>
-              <w:rPr>
-                <w:b/>
-                <w:sz w:val="20"/>
-              </w:rPr>
-              <w:t>Diff</w:t>
-            </w:r>
-          </w:p>
-        </w:tc>
-      </w:tr>
-      <w:tr>
-        <w:tc>
-          <w:tcPr>
-            <w:tcW w:type="dxa" w:w="2160"/>
-          </w:tcPr>
-          <w:p>
-            <w:pPr>
-              <w:jc w:val="center"/>
-            </w:pPr>
-            <w:r>
-              <w:rPr>
-                <w:sz w:val="20"/>
-              </w:rPr>
-              <w:t>Symptoms of bacterial vaginosis</w:t>
-            </w:r>
-          </w:p>
-        </w:tc>
-        <w:tc>
-          <w:tcPr>
-            <w:tcW w:type="dxa" w:w="2160"/>
-          </w:tcPr>
-          <w:p>
-            <w:pPr>
-              <w:jc w:val="center"/>
-            </w:pPr>
-            <w:r>
-              <w:rPr>
-                <w:sz w:val="20"/>
-              </w:rPr>
-              <w:t>100.0%</w:t>
-            </w:r>
-          </w:p>
-        </w:tc>
-        <w:tc>
-          <w:tcPr>
-            <w:tcW w:type="dxa" w:w="2160"/>
-          </w:tcPr>
-          <w:p>
-            <w:pPr>
-              <w:jc w:val="center"/>
-            </w:pPr>
-            <w:r>
-              <w:rPr>
-                <w:sz w:val="20"/>
-              </w:rPr>
-              <w:t>100.0%</w:t>
-            </w:r>
-          </w:p>
-        </w:tc>
-        <w:tc>
-          <w:tcPr>
-            <w:tcW w:type="dxa" w:w="2160"/>
-          </w:tcPr>
-          <w:p>
-            <w:pPr>
-              <w:jc w:val="center"/>
-            </w:pPr>
-            <w:r>
-              <w:rPr>
-                <w:sz w:val="20"/>
-              </w:rPr>
-              <w:t>+0.0%</w:t>
-            </w:r>
-          </w:p>
-        </w:tc>
-      </w:tr>
-      <w:tr>
-        <w:tc>
-          <w:tcPr>
-            <w:tcW w:type="dxa" w:w="2160"/>
-          </w:tcPr>
-          <w:p>
-            <w:pPr>
-              <w:jc w:val="center"/>
-            </w:pPr>
-            <w:r>
-              <w:rPr>
-                <w:sz w:val="20"/>
-              </w:rPr>
-              <w:t>Causes of varicose veins</w:t>
-            </w:r>
-          </w:p>
-        </w:tc>
-        <w:tc>
-          <w:tcPr>
-            <w:tcW w:type="dxa" w:w="2160"/>
-          </w:tcPr>
-          <w:p>
-            <w:pPr>
-              <w:jc w:val="center"/>
-            </w:pPr>
-            <w:r>
-              <w:rPr>
-                <w:sz w:val="20"/>
-              </w:rPr>
-              <w:t>100.0%</w:t>
-            </w:r>
-          </w:p>
-        </w:tc>
-        <w:tc>
-          <w:tcPr>
-            <w:tcW w:type="dxa" w:w="2160"/>
-          </w:tcPr>
-          <w:p>
-            <w:pPr>
-              <w:jc w:val="center"/>
-            </w:pPr>
-            <w:r>
-              <w:rPr>
-                <w:sz w:val="20"/>
-              </w:rPr>
-              <w:t>100.0%</w:t>
-            </w:r>
-          </w:p>
-        </w:tc>
-        <w:tc>
-          <w:tcPr>
-            <w:tcW w:type="dxa" w:w="2160"/>
-          </w:tcPr>
-          <w:p>
-            <w:pPr>
-              <w:jc w:val="center"/>
-            </w:pPr>
-            <w:r>
-              <w:rPr>
-                <w:sz w:val="20"/>
-              </w:rPr>
-              <w:t>+0.0%</w:t>
-            </w:r>
-          </w:p>
-        </w:tc>
-      </w:tr>
-      <w:tr>
-        <w:tc>
-          <w:tcPr>
-            <w:tcW w:type="dxa" w:w="2160"/>
-          </w:tcPr>
-          <w:p>
-            <w:pPr>
-              <w:jc w:val="center"/>
-            </w:pPr>
-            <w:r>
-              <w:rPr>
-                <w:sz w:val="20"/>
-              </w:rPr>
-              <w:t>Preventing melanoma</w:t>
-            </w:r>
-          </w:p>
-        </w:tc>
-        <w:tc>
-          <w:tcPr>
-            <w:tcW w:type="dxa" w:w="2160"/>
-          </w:tcPr>
-          <w:p>
-            <w:pPr>
-              <w:jc w:val="center"/>
-            </w:pPr>
-            <w:r>
-              <w:rPr>
-                <w:sz w:val="20"/>
-              </w:rPr>
-              <w:t>100.0%</w:t>
-            </w:r>
-          </w:p>
-        </w:tc>
-        <w:tc>
-          <w:tcPr>
-            <w:tcW w:type="dxa" w:w="2160"/>
-          </w:tcPr>
-          <w:p>
-            <w:pPr>
-              <w:jc w:val="center"/>
-            </w:pPr>
-            <w:r>
-              <w:rPr>
-                <w:sz w:val="20"/>
-              </w:rPr>
-              <w:t>100.0%</w:t>
-            </w:r>
-          </w:p>
-        </w:tc>
-        <w:tc>
-          <w:tcPr>
-            <w:tcW w:type="dxa" w:w="2160"/>
-          </w:tcPr>
-          <w:p>
-            <w:pPr>
-              <w:jc w:val="center"/>
-            </w:pPr>
-            <w:r>
-              <w:rPr>
-                <w:sz w:val="20"/>
-              </w:rPr>
-              <w:t>+0.0%</w:t>
-            </w:r>
-          </w:p>
-        </w:tc>
-      </w:tr>
-      <w:tr>
-        <w:tc>
-          <w:tcPr>
-            <w:tcW w:type="dxa" w:w="2160"/>
-          </w:tcPr>
-          <w:p>
-            <w:pPr>
-              <w:jc w:val="center"/>
-            </w:pPr>
-            <w:r>
-              <w:rPr>
-                <w:sz w:val="20"/>
-              </w:rPr>
-              <w:t>Living with type 1 diabetes</w:t>
-            </w:r>
-          </w:p>
-        </w:tc>
-        <w:tc>
-          <w:tcPr>
-            <w:tcW w:type="dxa" w:w="2160"/>
-          </w:tcPr>
-          <w:p>
-            <w:pPr>
-              <w:jc w:val="center"/>
-            </w:pPr>
-            <w:r>
-              <w:rPr>
-                <w:sz w:val="20"/>
-              </w:rPr>
-              <w:t>80.0%</w:t>
-            </w:r>
-          </w:p>
-        </w:tc>
-        <w:tc>
-          <w:tcPr>
-            <w:tcW w:type="dxa" w:w="2160"/>
-          </w:tcPr>
-          <w:p>
-            <w:pPr>
-              <w:jc w:val="center"/>
-            </w:pPr>
-            <w:r>
-              <w:rPr>
-                <w:sz w:val="20"/>
-              </w:rPr>
-              <w:t>100.0%</w:t>
-            </w:r>
-          </w:p>
-        </w:tc>
-        <w:tc>
-          <w:tcPr>
-            <w:tcW w:type="dxa" w:w="2160"/>
-          </w:tcPr>
-          <w:p>
-            <w:pPr>
-              <w:jc w:val="center"/>
-            </w:pPr>
-            <w:r>
-              <w:rPr>
-                <w:sz w:val="20"/>
-              </w:rPr>
-              <w:t>+20.0%</w:t>
-            </w:r>
-          </w:p>
-        </w:tc>
-      </w:tr>
-      <w:tr>
-        <w:tc>
-          <w:tcPr>
-            <w:tcW w:type="dxa" w:w="2160"/>
-          </w:tcPr>
-          <w:p>
-            <w:pPr>
-              <w:jc w:val="center"/>
-            </w:pPr>
-            <w:r>
-              <w:rPr>
-                <w:sz w:val="20"/>
-              </w:rPr>
-              <w:t>MRSA</w:t>
-            </w:r>
-          </w:p>
-        </w:tc>
-        <w:tc>
-          <w:tcPr>
-            <w:tcW w:type="dxa" w:w="2160"/>
-          </w:tcPr>
-          <w:p>
-            <w:pPr>
-              <w:jc w:val="center"/>
-            </w:pPr>
-            <w:r>
-              <w:rPr>
-                <w:sz w:val="20"/>
-              </w:rPr>
-              <w:t>60.0%</w:t>
-            </w:r>
-          </w:p>
-        </w:tc>
-        <w:tc>
-          <w:tcPr>
-            <w:tcW w:type="dxa" w:w="2160"/>
-          </w:tcPr>
-          <w:p>
-            <w:pPr>
-              <w:jc w:val="center"/>
-            </w:pPr>
-            <w:r>
-              <w:rPr>
-                <w:sz w:val="20"/>
-              </w:rPr>
-              <w:t>100.0%</w:t>
-            </w:r>
-          </w:p>
-        </w:tc>
-        <w:tc>
-          <w:tcPr>
-            <w:tcW w:type="dxa" w:w="2160"/>
-          </w:tcPr>
-          <w:p>
-            <w:pPr>
-              <w:jc w:val="center"/>
-            </w:pPr>
-            <w:r>
-              <w:rPr>
-                <w:sz w:val="20"/>
-              </w:rPr>
-              <w:t>+40.0%</w:t>
-            </w:r>
-          </w:p>
-        </w:tc>
-      </w:tr>
-    </w:tbl>
-    <w:p/>
-    <w:p>
-      <w:pPr>
-        <w:jc w:val="center"/>
-      </w:pPr>
-      <w:r>
-        <w:drawing>
-          <wp:inline xmlns:a="http://schemas.openxmlformats.org/drawingml/2006/main" xmlns:pic="http://schemas.openxmlformats.org/drawingml/2006/picture">
-            <wp:extent cx="5029200" cy="2514600"/>
-            <wp:docPr id="2" name="Picture 2"/>
-            <wp:cNvGraphicFramePr>
-              <a:graphicFrameLocks noChangeAspect="1"/>
-            </wp:cNvGraphicFramePr>
-            <a:graphic>
-              <a:graphicData uri="http://schemas.openxmlformats.org/drawingml/2006/picture">
-                <pic:pic>
-                  <pic:nvPicPr>
-                    <pic:cNvPr id="0" name="chart_fair_faithfulness.png"/>
-                    <pic:cNvPicPr/>
-                  </pic:nvPicPr>
-                  <pic:blipFill>
-                    <a:blip r:embed="rId10"/>
-                    <a:stretch>
-                      <a:fillRect/>
-                    </a:stretch>
-                  </pic:blipFill>
-                  <pic:spPr>
-                    <a:xfrm>
-                      <a:off x="0" y="0"/>
-                      <a:ext cx="5029200" cy="2514600"/>
-                    </a:xfrm>
-                    <a:prstGeom prst="rect"/>
-                  </pic:spPr>
-                </pic:pic>
-              </a:graphicData>
-            </a:graphic>
-          </wp:inline>
-        </w:drawing>
-      </w:r>
-    </w:p>
-    <w:p/>
-    <w:p>
-      <w:pPr>
-        <w:pStyle w:val="Heading2"/>
-      </w:pPr>
-      <w:r>
-        <w:rPr>
-          <w:color w:val="1A1A2E"/>
-        </w:rPr>
-        <w:t>3.2 Context Recall</w:t>
-      </w:r>
-    </w:p>
-    <w:tbl>
-      <w:tblPr>
-        <w:tblStyle w:val="LightGrid-Accent1"/>
-        <w:tblW w:type="auto" w:w="0"/>
-        <w:jc w:val="center"/>
-        <w:tblLook w:firstColumn="1" w:firstRow="1" w:lastColumn="0" w:lastRow="0" w:noHBand="0" w:noVBand="1" w:val="04A0"/>
-      </w:tblPr>
-      <w:tblGrid>
-        <w:gridCol w:w="2160"/>
-        <w:gridCol w:w="2160"/>
-        <w:gridCol w:w="2160"/>
-        <w:gridCol w:w="2160"/>
-      </w:tblGrid>
-      <w:tr>
-        <w:tc>
-          <w:tcPr>
-            <w:tcW w:type="dxa" w:w="2160"/>
-          </w:tcPr>
-          <w:p>
-            <w:pPr>
-              <w:jc w:val="center"/>
-            </w:pPr>
-            <w:r>
-              <w:rPr>
-                <w:b/>
-                <w:sz w:val="20"/>
-              </w:rPr>
-              <w:t>Question</w:t>
-            </w:r>
-          </w:p>
-        </w:tc>
-        <w:tc>
-          <w:tcPr>
-            <w:tcW w:type="dxa" w:w="2160"/>
-          </w:tcPr>
-          <w:p>
-            <w:pPr>
-              <w:jc w:val="center"/>
-            </w:pPr>
-            <w:r>
-              <w:rPr>
-                <w:b/>
-                <w:sz w:val="20"/>
-              </w:rPr>
-              <w:t>Ollama</w:t>
-            </w:r>
-          </w:p>
-        </w:tc>
-        <w:tc>
-          <w:tcPr>
-            <w:tcW w:type="dxa" w:w="2160"/>
-          </w:tcPr>
-          <w:p>
-            <w:pPr>
-              <w:jc w:val="center"/>
-            </w:pPr>
-            <w:r>
-              <w:rPr>
-                <w:b/>
-                <w:sz w:val="20"/>
-              </w:rPr>
-              <w:t>Groq</w:t>
-            </w:r>
-          </w:p>
-        </w:tc>
-        <w:tc>
-          <w:tcPr>
-            <w:tcW w:type="dxa" w:w="2160"/>
-          </w:tcPr>
-          <w:p>
-            <w:pPr>
-              <w:jc w:val="center"/>
-            </w:pPr>
-            <w:r>
-              <w:rPr>
-                <w:b/>
-                <w:sz w:val="20"/>
-              </w:rPr>
-              <w:t>Diff</w:t>
-            </w:r>
-          </w:p>
-        </w:tc>
-      </w:tr>
-      <w:tr>
-        <w:tc>
-          <w:tcPr>
-            <w:tcW w:type="dxa" w:w="2160"/>
-          </w:tcPr>
-          <w:p>
-            <w:pPr>
-              <w:jc w:val="center"/>
-            </w:pPr>
-            <w:r>
-              <w:rPr>
-                <w:sz w:val="20"/>
-              </w:rPr>
-              <w:t>Symptoms of bacterial vaginosis</w:t>
-            </w:r>
-          </w:p>
-        </w:tc>
-        <w:tc>
-          <w:tcPr>
-            <w:tcW w:type="dxa" w:w="2160"/>
-          </w:tcPr>
-          <w:p>
-            <w:pPr>
-              <w:jc w:val="center"/>
-            </w:pPr>
-            <w:r>
-              <w:rPr>
-                <w:sz w:val="20"/>
-              </w:rPr>
-              <w:t>100.0%</w:t>
-            </w:r>
-          </w:p>
-        </w:tc>
-        <w:tc>
-          <w:tcPr>
-            <w:tcW w:type="dxa" w:w="2160"/>
-          </w:tcPr>
-          <w:p>
-            <w:pPr>
-              <w:jc w:val="center"/>
-            </w:pPr>
-            <w:r>
-              <w:rPr>
-                <w:sz w:val="20"/>
-              </w:rPr>
-              <w:t>100.0%</w:t>
-            </w:r>
-          </w:p>
-        </w:tc>
-        <w:tc>
-          <w:tcPr>
-            <w:tcW w:type="dxa" w:w="2160"/>
-          </w:tcPr>
-          <w:p>
-            <w:pPr>
-              <w:jc w:val="center"/>
-            </w:pPr>
-            <w:r>
-              <w:rPr>
-                <w:sz w:val="20"/>
-              </w:rPr>
-              <w:t>+0.0%</w:t>
-            </w:r>
-          </w:p>
-        </w:tc>
-      </w:tr>
-      <w:tr>
-        <w:tc>
-          <w:tcPr>
-            <w:tcW w:type="dxa" w:w="2160"/>
-          </w:tcPr>
-          <w:p>
-            <w:pPr>
-              <w:jc w:val="center"/>
-            </w:pPr>
-            <w:r>
-              <w:rPr>
-                <w:sz w:val="20"/>
-              </w:rPr>
-              <w:t>Causes of varicose veins</w:t>
-            </w:r>
-          </w:p>
-        </w:tc>
-        <w:tc>
-          <w:tcPr>
-            <w:tcW w:type="dxa" w:w="2160"/>
-          </w:tcPr>
-          <w:p>
-            <w:pPr>
-              <w:jc w:val="center"/>
-            </w:pPr>
-            <w:r>
-              <w:rPr>
-                <w:sz w:val="20"/>
-              </w:rPr>
-              <w:t>100.0%</w:t>
-            </w:r>
-          </w:p>
-        </w:tc>
-        <w:tc>
-          <w:tcPr>
-            <w:tcW w:type="dxa" w:w="2160"/>
-          </w:tcPr>
-          <w:p>
-            <w:pPr>
-              <w:jc w:val="center"/>
-            </w:pPr>
-            <w:r>
-              <w:rPr>
-                <w:sz w:val="20"/>
-              </w:rPr>
-              <w:t>100.0%</w:t>
-            </w:r>
-          </w:p>
-        </w:tc>
-        <w:tc>
-          <w:tcPr>
-            <w:tcW w:type="dxa" w:w="2160"/>
-          </w:tcPr>
-          <w:p>
-            <w:pPr>
-              <w:jc w:val="center"/>
-            </w:pPr>
-            <w:r>
-              <w:rPr>
-                <w:sz w:val="20"/>
-              </w:rPr>
-              <w:t>+0.0%</w:t>
-            </w:r>
-          </w:p>
-        </w:tc>
-      </w:tr>
-      <w:tr>
-        <w:tc>
-          <w:tcPr>
-            <w:tcW w:type="dxa" w:w="2160"/>
-          </w:tcPr>
-          <w:p>
-            <w:pPr>
-              <w:jc w:val="center"/>
-            </w:pPr>
-            <w:r>
-              <w:rPr>
-                <w:sz w:val="20"/>
-              </w:rPr>
-              <w:t>Preventing melanoma</w:t>
-            </w:r>
-          </w:p>
-        </w:tc>
-        <w:tc>
-          <w:tcPr>
-            <w:tcW w:type="dxa" w:w="2160"/>
-          </w:tcPr>
-          <w:p>
-            <w:pPr>
-              <w:jc w:val="center"/>
-            </w:pPr>
-            <w:r>
-              <w:rPr>
-                <w:sz w:val="20"/>
-              </w:rPr>
-              <w:t>100.0%</w:t>
-            </w:r>
-          </w:p>
-        </w:tc>
-        <w:tc>
-          <w:tcPr>
-            <w:tcW w:type="dxa" w:w="2160"/>
-          </w:tcPr>
-          <w:p>
-            <w:pPr>
-              <w:jc w:val="center"/>
-            </w:pPr>
-            <w:r>
-              <w:rPr>
-                <w:sz w:val="20"/>
-              </w:rPr>
-              <w:t>100.0%</w:t>
-            </w:r>
-          </w:p>
-        </w:tc>
-        <w:tc>
-          <w:tcPr>
-            <w:tcW w:type="dxa" w:w="2160"/>
-          </w:tcPr>
-          <w:p>
-            <w:pPr>
-              <w:jc w:val="center"/>
-            </w:pPr>
-            <w:r>
-              <w:rPr>
-                <w:sz w:val="20"/>
-              </w:rPr>
-              <w:t>+0.0%</w:t>
-            </w:r>
-          </w:p>
-        </w:tc>
-      </w:tr>
-      <w:tr>
-        <w:tc>
-          <w:tcPr>
-            <w:tcW w:type="dxa" w:w="2160"/>
-          </w:tcPr>
-          <w:p>
-            <w:pPr>
-              <w:jc w:val="center"/>
-            </w:pPr>
-            <w:r>
-              <w:rPr>
-                <w:sz w:val="20"/>
-              </w:rPr>
-              <w:t>Living with type 1 diabetes</w:t>
-            </w:r>
-          </w:p>
-        </w:tc>
-        <w:tc>
-          <w:tcPr>
-            <w:tcW w:type="dxa" w:w="2160"/>
-          </w:tcPr>
-          <w:p>
-            <w:pPr>
-              <w:jc w:val="center"/>
-            </w:pPr>
-            <w:r>
-              <w:rPr>
-                <w:sz w:val="20"/>
-              </w:rPr>
-              <w:t>100.0%</w:t>
-            </w:r>
-          </w:p>
-        </w:tc>
-        <w:tc>
-          <w:tcPr>
-            <w:tcW w:type="dxa" w:w="2160"/>
-          </w:tcPr>
-          <w:p>
-            <w:pPr>
-              <w:jc w:val="center"/>
-            </w:pPr>
-            <w:r>
-              <w:rPr>
-                <w:sz w:val="20"/>
-              </w:rPr>
-              <w:t>100.0%</w:t>
-            </w:r>
-          </w:p>
-        </w:tc>
-        <w:tc>
-          <w:tcPr>
-            <w:tcW w:type="dxa" w:w="2160"/>
-          </w:tcPr>
-          <w:p>
-            <w:pPr>
-              <w:jc w:val="center"/>
-            </w:pPr>
-            <w:r>
-              <w:rPr>
-                <w:sz w:val="20"/>
-              </w:rPr>
-              <w:t>+0.0%</w:t>
-            </w:r>
-          </w:p>
-        </w:tc>
-      </w:tr>
-      <w:tr>
-        <w:tc>
-          <w:tcPr>
-            <w:tcW w:type="dxa" w:w="2160"/>
-          </w:tcPr>
-          <w:p>
-            <w:pPr>
-              <w:jc w:val="center"/>
-            </w:pPr>
-            <w:r>
-              <w:rPr>
-                <w:sz w:val="20"/>
-              </w:rPr>
-              <w:t>MRSA</w:t>
-            </w:r>
-          </w:p>
-        </w:tc>
-        <w:tc>
-          <w:tcPr>
-            <w:tcW w:type="dxa" w:w="2160"/>
-          </w:tcPr>
-          <w:p>
-            <w:pPr>
-              <w:jc w:val="center"/>
-            </w:pPr>
-            <w:r>
-              <w:rPr>
-                <w:sz w:val="20"/>
-              </w:rPr>
-              <w:t>100.0%</w:t>
-            </w:r>
-          </w:p>
-        </w:tc>
-        <w:tc>
-          <w:tcPr>
-            <w:tcW w:type="dxa" w:w="2160"/>
-          </w:tcPr>
-          <w:p>
-            <w:pPr>
-              <w:jc w:val="center"/>
-            </w:pPr>
-            <w:r>
-              <w:rPr>
-                <w:sz w:val="20"/>
-              </w:rPr>
-              <w:t>100.0%</w:t>
-            </w:r>
-          </w:p>
-        </w:tc>
-        <w:tc>
-          <w:tcPr>
-            <w:tcW w:type="dxa" w:w="2160"/>
-          </w:tcPr>
-          <w:p>
-            <w:pPr>
-              <w:jc w:val="center"/>
-            </w:pPr>
-            <w:r>
-              <w:rPr>
-                <w:sz w:val="20"/>
-              </w:rPr>
-              <w:t>+0.0%</w:t>
-            </w:r>
-          </w:p>
-        </w:tc>
-      </w:tr>
-    </w:tbl>
-    <w:p/>
-    <w:p>
-      <w:pPr>
-        <w:jc w:val="center"/>
-      </w:pPr>
-      <w:r>
-        <w:drawing>
-          <wp:inline xmlns:a="http://schemas.openxmlformats.org/drawingml/2006/main" xmlns:pic="http://schemas.openxmlformats.org/drawingml/2006/picture">
-            <wp:extent cx="5029200" cy="2514600"/>
-            <wp:docPr id="3" name="Picture 3"/>
-            <wp:cNvGraphicFramePr>
-              <a:graphicFrameLocks noChangeAspect="1"/>
-            </wp:cNvGraphicFramePr>
-            <a:graphic>
-              <a:graphicData uri="http://schemas.openxmlformats.org/drawingml/2006/picture">
-                <pic:pic>
-                  <pic:nvPicPr>
-                    <pic:cNvPr id="0" name="chart_fair_context_recall.png"/>
-                    <pic:cNvPicPr/>
-                  </pic:nvPicPr>
-                  <pic:blipFill>
-                    <a:blip r:embed="rId11"/>
-                    <a:stretch>
-                      <a:fillRect/>
-                    </a:stretch>
-                  </pic:blipFill>
-                  <pic:spPr>
-                    <a:xfrm>
-                      <a:off x="0" y="0"/>
-                      <a:ext cx="5029200" cy="2514600"/>
-                    </a:xfrm>
-                    <a:prstGeom prst="rect"/>
-                  </pic:spPr>
-                </pic:pic>
-              </a:graphicData>
-            </a:graphic>
-          </wp:inline>
-        </w:drawing>
-      </w:r>
-    </w:p>
-    <w:p/>
-    <w:p>
-      <w:pPr>
-        <w:pStyle w:val="Heading2"/>
-      </w:pPr>
-      <w:r>
-        <w:rPr>
-          <w:color w:val="1A1A2E"/>
-        </w:rPr>
-        <w:t>3.3 BLEU Score</w:t>
-      </w:r>
-    </w:p>
-    <w:tbl>
-      <w:tblPr>
-        <w:tblStyle w:val="LightGrid-Accent1"/>
-        <w:tblW w:type="auto" w:w="0"/>
-        <w:jc w:val="center"/>
-        <w:tblLook w:firstColumn="1" w:firstRow="1" w:lastColumn="0" w:lastRow="0" w:noHBand="0" w:noVBand="1" w:val="04A0"/>
-      </w:tblPr>
-      <w:tblGrid>
-        <w:gridCol w:w="2160"/>
-        <w:gridCol w:w="2160"/>
-        <w:gridCol w:w="2160"/>
-        <w:gridCol w:w="2160"/>
-      </w:tblGrid>
-      <w:tr>
-        <w:tc>
-          <w:tcPr>
-            <w:tcW w:type="dxa" w:w="2160"/>
-          </w:tcPr>
-          <w:p>
-            <w:pPr>
-              <w:jc w:val="center"/>
-            </w:pPr>
-            <w:r>
-              <w:rPr>
-                <w:b/>
-                <w:sz w:val="20"/>
-              </w:rPr>
-              <w:t>Question</w:t>
-            </w:r>
-          </w:p>
-        </w:tc>
-        <w:tc>
-          <w:tcPr>
-            <w:tcW w:type="dxa" w:w="2160"/>
-          </w:tcPr>
-          <w:p>
-            <w:pPr>
-              <w:jc w:val="center"/>
-            </w:pPr>
-            <w:r>
-              <w:rPr>
-                <w:b/>
-                <w:sz w:val="20"/>
-              </w:rPr>
-              <w:t>Ollama</w:t>
-            </w:r>
-          </w:p>
-        </w:tc>
-        <w:tc>
-          <w:tcPr>
-            <w:tcW w:type="dxa" w:w="2160"/>
-          </w:tcPr>
-          <w:p>
-            <w:pPr>
-              <w:jc w:val="center"/>
-            </w:pPr>
-            <w:r>
-              <w:rPr>
-                <w:b/>
-                <w:sz w:val="20"/>
-              </w:rPr>
-              <w:t>Groq</w:t>
-            </w:r>
-          </w:p>
-        </w:tc>
-        <w:tc>
-          <w:tcPr>
-            <w:tcW w:type="dxa" w:w="2160"/>
-          </w:tcPr>
-          <w:p>
-            <w:pPr>
-              <w:jc w:val="center"/>
-            </w:pPr>
-            <w:r>
-              <w:rPr>
-                <w:b/>
-                <w:sz w:val="20"/>
-              </w:rPr>
-              <w:t>Diff</w:t>
-            </w:r>
-          </w:p>
-        </w:tc>
-      </w:tr>
-      <w:tr>
-        <w:tc>
-          <w:tcPr>
-            <w:tcW w:type="dxa" w:w="2160"/>
-          </w:tcPr>
-          <w:p>
-            <w:pPr>
-              <w:jc w:val="center"/>
-            </w:pPr>
-            <w:r>
-              <w:rPr>
-                <w:sz w:val="20"/>
-              </w:rPr>
-              <w:t>Symptoms of bacterial vaginosis</w:t>
-            </w:r>
-          </w:p>
-        </w:tc>
-        <w:tc>
-          <w:tcPr>
-            <w:tcW w:type="dxa" w:w="2160"/>
-          </w:tcPr>
-          <w:p>
-            <w:pPr>
-              <w:jc w:val="center"/>
-            </w:pPr>
-            <w:r>
-              <w:rPr>
-                <w:sz w:val="20"/>
-              </w:rPr>
-              <w:t>91.1%</w:t>
-            </w:r>
-          </w:p>
-        </w:tc>
-        <w:tc>
-          <w:tcPr>
-            <w:tcW w:type="dxa" w:w="2160"/>
-          </w:tcPr>
-          <w:p>
-            <w:pPr>
-              <w:jc w:val="center"/>
-            </w:pPr>
-            <w:r>
-              <w:rPr>
-                <w:sz w:val="20"/>
-              </w:rPr>
-              <w:t>86.8%</w:t>
-            </w:r>
-          </w:p>
-        </w:tc>
-        <w:tc>
-          <w:tcPr>
-            <w:tcW w:type="dxa" w:w="2160"/>
-          </w:tcPr>
-          <w:p>
-            <w:pPr>
-              <w:jc w:val="center"/>
-            </w:pPr>
-            <w:r>
-              <w:rPr>
-                <w:sz w:val="20"/>
-              </w:rPr>
-              <w:t>-4.3%</w:t>
-            </w:r>
-          </w:p>
-        </w:tc>
-      </w:tr>
-      <w:tr>
-        <w:tc>
-          <w:tcPr>
-            <w:tcW w:type="dxa" w:w="2160"/>
-          </w:tcPr>
-          <w:p>
-            <w:pPr>
-              <w:jc w:val="center"/>
-            </w:pPr>
-            <w:r>
-              <w:rPr>
-                <w:sz w:val="20"/>
-              </w:rPr>
-              <w:t>Causes of varicose veins</w:t>
-            </w:r>
-          </w:p>
-        </w:tc>
-        <w:tc>
-          <w:tcPr>
-            <w:tcW w:type="dxa" w:w="2160"/>
-          </w:tcPr>
-          <w:p>
-            <w:pPr>
-              <w:jc w:val="center"/>
-            </w:pPr>
-            <w:r>
-              <w:rPr>
-                <w:sz w:val="20"/>
-              </w:rPr>
-              <w:t>45.9%</w:t>
-            </w:r>
-          </w:p>
-        </w:tc>
-        <w:tc>
-          <w:tcPr>
-            <w:tcW w:type="dxa" w:w="2160"/>
-          </w:tcPr>
-          <w:p>
-            <w:pPr>
-              <w:jc w:val="center"/>
-            </w:pPr>
-            <w:r>
-              <w:rPr>
-                <w:sz w:val="20"/>
-              </w:rPr>
-              <w:t>36.1%</w:t>
-            </w:r>
-          </w:p>
-        </w:tc>
-        <w:tc>
-          <w:tcPr>
-            <w:tcW w:type="dxa" w:w="2160"/>
-          </w:tcPr>
-          <w:p>
-            <w:pPr>
-              <w:jc w:val="center"/>
-            </w:pPr>
-            <w:r>
-              <w:rPr>
-                <w:sz w:val="20"/>
-              </w:rPr>
-              <w:t>-9.8%</w:t>
-            </w:r>
-          </w:p>
-        </w:tc>
-      </w:tr>
-      <w:tr>
-        <w:tc>
-          <w:tcPr>
-            <w:tcW w:type="dxa" w:w="2160"/>
-          </w:tcPr>
-          <w:p>
-            <w:pPr>
-              <w:jc w:val="center"/>
-            </w:pPr>
-            <w:r>
-              <w:rPr>
-                <w:sz w:val="20"/>
-              </w:rPr>
-              <w:t>Preventing melanoma</w:t>
-            </w:r>
-          </w:p>
-        </w:tc>
-        <w:tc>
-          <w:tcPr>
-            <w:tcW w:type="dxa" w:w="2160"/>
-          </w:tcPr>
-          <w:p>
-            <w:pPr>
-              <w:jc w:val="center"/>
-            </w:pPr>
-            <w:r>
-              <w:rPr>
-                <w:sz w:val="20"/>
-              </w:rPr>
-              <w:t>78.5%</w:t>
-            </w:r>
-          </w:p>
-        </w:tc>
-        <w:tc>
-          <w:tcPr>
-            <w:tcW w:type="dxa" w:w="2160"/>
-          </w:tcPr>
-          <w:p>
-            <w:pPr>
-              <w:jc w:val="center"/>
-            </w:pPr>
-            <w:r>
-              <w:rPr>
-                <w:sz w:val="20"/>
-              </w:rPr>
-              <w:t>96.9%</w:t>
-            </w:r>
-          </w:p>
-        </w:tc>
-        <w:tc>
-          <w:tcPr>
-            <w:tcW w:type="dxa" w:w="2160"/>
-          </w:tcPr>
-          <w:p>
-            <w:pPr>
-              <w:jc w:val="center"/>
-            </w:pPr>
-            <w:r>
-              <w:rPr>
-                <w:sz w:val="20"/>
-              </w:rPr>
-              <w:t>+18.5%</w:t>
-            </w:r>
-          </w:p>
-        </w:tc>
-      </w:tr>
-      <w:tr>
-        <w:tc>
-          <w:tcPr>
-            <w:tcW w:type="dxa" w:w="2160"/>
-          </w:tcPr>
-          <w:p>
-            <w:pPr>
-              <w:jc w:val="center"/>
-            </w:pPr>
-            <w:r>
-              <w:rPr>
-                <w:sz w:val="20"/>
-              </w:rPr>
-              <w:t>Living with type 1 diabetes</w:t>
-            </w:r>
-          </w:p>
-        </w:tc>
-        <w:tc>
-          <w:tcPr>
-            <w:tcW w:type="dxa" w:w="2160"/>
-          </w:tcPr>
-          <w:p>
-            <w:pPr>
-              <w:jc w:val="center"/>
-            </w:pPr>
-            <w:r>
-              <w:rPr>
-                <w:sz w:val="20"/>
-              </w:rPr>
-              <w:t>9.6%</w:t>
-            </w:r>
-          </w:p>
-        </w:tc>
-        <w:tc>
-          <w:tcPr>
-            <w:tcW w:type="dxa" w:w="2160"/>
-          </w:tcPr>
-          <w:p>
-            <w:pPr>
-              <w:jc w:val="center"/>
-            </w:pPr>
-            <w:r>
-              <w:rPr>
-                <w:sz w:val="20"/>
-              </w:rPr>
-              <w:t>20.0%</w:t>
-            </w:r>
-          </w:p>
-        </w:tc>
-        <w:tc>
-          <w:tcPr>
-            <w:tcW w:type="dxa" w:w="2160"/>
-          </w:tcPr>
-          <w:p>
-            <w:pPr>
-              <w:jc w:val="center"/>
-            </w:pPr>
-            <w:r>
-              <w:rPr>
-                <w:sz w:val="20"/>
-              </w:rPr>
-              <w:t>+10.4%</w:t>
-            </w:r>
-          </w:p>
-        </w:tc>
-      </w:tr>
-      <w:tr>
-        <w:tc>
-          <w:tcPr>
-            <w:tcW w:type="dxa" w:w="2160"/>
-          </w:tcPr>
-          <w:p>
-            <w:pPr>
-              <w:jc w:val="center"/>
-            </w:pPr>
-            <w:r>
-              <w:rPr>
-                <w:sz w:val="20"/>
-              </w:rPr>
-              <w:t>MRSA</w:t>
-            </w:r>
-          </w:p>
-        </w:tc>
-        <w:tc>
-          <w:tcPr>
-            <w:tcW w:type="dxa" w:w="2160"/>
-          </w:tcPr>
-          <w:p>
-            <w:pPr>
-              <w:jc w:val="center"/>
-            </w:pPr>
-            <w:r>
-              <w:rPr>
-                <w:sz w:val="20"/>
-              </w:rPr>
-              <w:t>34.2%</w:t>
-            </w:r>
-          </w:p>
-        </w:tc>
-        <w:tc>
-          <w:tcPr>
-            <w:tcW w:type="dxa" w:w="2160"/>
-          </w:tcPr>
-          <w:p>
-            <w:pPr>
-              <w:jc w:val="center"/>
-            </w:pPr>
-            <w:r>
-              <w:rPr>
-                <w:sz w:val="20"/>
-              </w:rPr>
-              <w:t>78.6%</w:t>
-            </w:r>
-          </w:p>
-        </w:tc>
-        <w:tc>
-          <w:tcPr>
-            <w:tcW w:type="dxa" w:w="2160"/>
-          </w:tcPr>
-          <w:p>
-            <w:pPr>
-              <w:jc w:val="center"/>
-            </w:pPr>
-            <w:r>
-              <w:rPr>
-                <w:sz w:val="20"/>
-              </w:rPr>
-              <w:t>+44.3%</w:t>
-            </w:r>
-          </w:p>
-        </w:tc>
-      </w:tr>
-    </w:tbl>
-    <w:p/>
-    <w:p>
-      <w:pPr>
-        <w:jc w:val="center"/>
-      </w:pPr>
-      <w:r>
-        <w:drawing>
-          <wp:inline xmlns:a="http://schemas.openxmlformats.org/drawingml/2006/main" xmlns:pic="http://schemas.openxmlformats.org/drawingml/2006/picture">
-            <wp:extent cx="5029200" cy="2514600"/>
-            <wp:docPr id="4" name="Picture 4"/>
-            <wp:cNvGraphicFramePr>
-              <a:graphicFrameLocks noChangeAspect="1"/>
-            </wp:cNvGraphicFramePr>
-            <a:graphic>
-              <a:graphicData uri="http://schemas.openxmlformats.org/drawingml/2006/picture">
-                <pic:pic>
-                  <pic:nvPicPr>
-                    <pic:cNvPr id="0" name="chart_fair_bleu.png"/>
-                    <pic:cNvPicPr/>
-                  </pic:nvPicPr>
-                  <pic:blipFill>
-                    <a:blip r:embed="rId12"/>
-                    <a:stretch>
-                      <a:fillRect/>
-                    </a:stretch>
-                  </pic:blipFill>
-                  <pic:spPr>
-                    <a:xfrm>
-                      <a:off x="0" y="0"/>
-                      <a:ext cx="5029200" cy="2514600"/>
-                    </a:xfrm>
-                    <a:prstGeom prst="rect"/>
-                  </pic:spPr>
-                </pic:pic>
-              </a:graphicData>
-            </a:graphic>
-          </wp:inline>
-        </w:drawing>
-      </w:r>
-    </w:p>
-    <w:p/>
-    <w:p>
-      <w:pPr>
-        <w:pStyle w:val="Heading1"/>
-      </w:pPr>
-      <w:r>
-        <w:rPr>
-          <w:color w:val="1A1A2E"/>
-        </w:rPr>
-        <w:t>4. What This Tells Us</w:t>
+        <w:t>3. What This Tells Us</w:t>
       </w:r>
     </w:p>
     <w:p>
@@ -1814,7 +405,7 @@
         <w:rPr>
           <w:color w:val="1A1A2E"/>
         </w:rPr>
-        <w:t>5. Original vs Fair Comparison</w:t>
+        <w:t>4. Original vs Fair Comparison</w:t>
       </w:r>
     </w:p>
     <w:tbl>
@@ -1945,7 +536,7 @@
               <w:rPr>
                 <w:sz w:val="20"/>
               </w:rPr>
-              <w:t>88.0%</w:t>
+              <w:t>80.0%</w:t>
             </w:r>
           </w:p>
         </w:tc>
@@ -1961,7 +552,7 @@
               <w:rPr>
                 <w:sz w:val="20"/>
               </w:rPr>
-              <w:t>+31.4%</w:t>
+              <w:t>+23.4%</w:t>
             </w:r>
           </w:p>
         </w:tc>
@@ -2077,7 +668,7 @@
               <w:rPr>
                 <w:sz w:val="20"/>
               </w:rPr>
-              <w:t>51.9%</w:t>
+              <w:t>46.8%</w:t>
             </w:r>
           </w:p>
         </w:tc>
@@ -2093,7 +684,7 @@
               <w:rPr>
                 <w:sz w:val="20"/>
               </w:rPr>
-              <w:t>-0.0%</w:t>
+              <w:t>-5.1%</w:t>
             </w:r>
           </w:p>
         </w:tc>

</xml_diff>